<commit_message>
fix link gg sheet
</commit_message>
<xml_diff>
--- a/HUONG_DAN_CCCD_Scanner.docx
+++ b/HUONG_DAN_CCCD_Scanner.docx
@@ -12,7 +12,6 @@
           <w:rFonts w:ascii="Segoe UI" w:cs="Segoe UI" w:eastAsia="Segoe UI" w:hAnsi="Segoe UI"/>
           <w:b/>
           <w:bCs/>
-          <w:color w:val="1E3A5F"/>
           <w:sz w:val="40"/>
           <w:szCs w:val="40"/>
         </w:rPr>
@@ -82,7 +81,7 @@
           <w:sz w:val="22"/>
           <w:szCs w:val="22"/>
         </w:rPr>
-        <w:t xml:space="preserve">, không cần đăng nhập, dữ liệu không rời thiết bị. Hỗ trợ xuất Excel và đẩy trực tiếp lên Google Sheets.</w:t>
+        <w:t xml:space="preserve">, không cần đăng nhập. Hỗ trợ xuất Excel và đẩy trực tiếp lên Google Sheets.</w:t>
       </w:r>
     </w:p>
     <w:p>
@@ -283,7 +282,7 @@
           <w:sz w:val="22"/>
           <w:szCs w:val="22"/>
         </w:rPr>
-        <w:t xml:space="preserve">URL này chạy qua HTTPS — bắt buộc để camera hoạt động trên điện thoại.</w:t>
+        <w:t xml:space="preserve">URL này chạy qua HTTPS — bắt buộc để camera hoạt động.</w:t>
       </w:r>
     </w:p>
     <w:p>
@@ -325,7 +324,7 @@
           <w:sz w:val="22"/>
           <w:szCs w:val="22"/>
         </w:rPr>
-        <w:t xml:space="preserve">Mở Safari (bắt buộc dùng Safari, không dùng Chrome)</w:t>
+        <w:t xml:space="preserve">Mở Safari (bắt buộc dùng Safari)</w:t>
       </w:r>
     </w:p>
     <w:p>
@@ -425,38 +424,8 @@
           <w:sz w:val="22"/>
           <w:szCs w:val="22"/>
         </w:rPr>
-        <w:t xml:space="preserve">Đặt tên → Bấm "Thêm"</w:t>
-      </w:r>
-    </w:p>
-    <w:p>
-      <w:pPr>
-        <w:spacing w:after="80"/>
-        <w:ind w:left="300"/>
-      </w:pPr>
-      <w:r>
-        <w:rPr>
-          <w:rFonts w:ascii="Segoe UI" w:cs="Segoe UI" w:eastAsia="Segoe UI" w:hAnsi="Segoe UI"/>
-          <w:b/>
-          <w:bCs/>
-          <w:color w:val="2E86DE"/>
-          <w:sz w:val="22"/>
-          <w:szCs w:val="22"/>
-        </w:rPr>
-        <w:t xml:space="preserve">6. </w:t>
-      </w:r>
-      <w:r>
-        <w:rPr>
-          <w:rFonts w:ascii="Segoe UI" w:cs="Segoe UI" w:eastAsia="Segoe UI" w:hAnsi="Segoe UI"/>
-          <w:sz w:val="22"/>
-          <w:szCs w:val="22"/>
-        </w:rPr>
-        <w:t xml:space="preserve">App xuất hiện trên màn hình chính như app thường, mở lên dùng luôn</w:t>
-      </w:r>
-    </w:p>
-    <w:p>
-      <w:pPr>
-        <w:spacing w:after="100"/>
-      </w:pPr>
+        <w:t xml:space="preserve">Đặt tên → Bấm "Thêm" — App xuất hiện trên màn hình chính</w:t>
+      </w:r>
     </w:p>
     <w:p>
       <w:pPr>
@@ -547,7 +516,7 @@
           <w:sz w:val="22"/>
           <w:szCs w:val="22"/>
         </w:rPr>
-        <w:t xml:space="preserve">Chrome sẽ hiện banner "Thêm vào màn hình chính" — bấm "Cài đặt"</w:t>
+        <w:t xml:space="preserve">Chrome hiện banner "Thêm vào màn hình chính" — bấm "Cài đặt"</w:t>
       </w:r>
     </w:p>
     <w:p>
@@ -572,38 +541,8 @@
           <w:sz w:val="22"/>
           <w:szCs w:val="22"/>
         </w:rPr>
-        <w:t xml:space="preserve">Nếu không thấy banner: bấm menu ⋮ → "Cài đặt ứng dụng" hoặc "Thêm vào màn hình chính"</w:t>
-      </w:r>
-    </w:p>
-    <w:p>
-      <w:pPr>
-        <w:spacing w:after="80"/>
-        <w:ind w:left="300"/>
-      </w:pPr>
-      <w:r>
-        <w:rPr>
-          <w:rFonts w:ascii="Segoe UI" w:cs="Segoe UI" w:eastAsia="Segoe UI" w:hAnsi="Segoe UI"/>
-          <w:b/>
-          <w:bCs/>
-          <w:color w:val="2E86DE"/>
-          <w:sz w:val="22"/>
-          <w:szCs w:val="22"/>
-        </w:rPr>
-        <w:t xml:space="preserve">5. </w:t>
-      </w:r>
-      <w:r>
-        <w:rPr>
-          <w:rFonts w:ascii="Segoe UI" w:cs="Segoe UI" w:eastAsia="Segoe UI" w:hAnsi="Segoe UI"/>
-          <w:sz w:val="22"/>
-          <w:szCs w:val="22"/>
-        </w:rPr>
-        <w:t xml:space="preserve">App xuất hiện trên màn hình chính, hoạt động như app thường</w:t>
-      </w:r>
-    </w:p>
-    <w:p>
-      <w:pPr>
-        <w:spacing w:after="100"/>
-      </w:pPr>
+        <w:t xml:space="preserve">Nếu không thấy: bấm menu ⋮ → "Thêm vào màn hình chính"</w:t>
+      </w:r>
     </w:p>
     <w:p>
       <w:pPr>
@@ -644,7 +583,23 @@
           <w:sz w:val="22"/>
           <w:szCs w:val="22"/>
         </w:rPr>
-        <w:t xml:space="preserve">Mở Terminal/Command Prompt tại thư mục cccd-scanner</w:t>
+        <w:t xml:space="preserve">Mở Terminal tại thư mục cccd-scanner, chạy:</w:t>
+      </w:r>
+    </w:p>
+    <w:p>
+      <w:pPr>
+        <w:spacing w:after="30"/>
+        <w:ind w:left="400"/>
+      </w:pPr>
+      <w:r>
+        <w:rPr>
+          <w:rFonts w:ascii="Consolas" w:cs="Consolas" w:eastAsia="Consolas" w:hAnsi="Consolas"/>
+          <w:color w:val="1E3A5F"/>
+          <w:sz w:val="20"/>
+          <w:szCs w:val="20"/>
+          <w:shd w:fill="F0F4F8" w:color="auto" w:val="clear"/>
+        </w:rPr>
+        <w:t xml:space="preserve">python -m http.server 8080</w:t>
       </w:r>
     </w:p>
     <w:p>
@@ -669,47 +624,6 @@
           <w:sz w:val="22"/>
           <w:szCs w:val="22"/>
         </w:rPr>
-        <w:t xml:space="preserve">Chạy lệnh:</w:t>
-      </w:r>
-    </w:p>
-    <w:p>
-      <w:pPr>
-        <w:spacing w:after="30"/>
-        <w:ind w:left="400"/>
-      </w:pPr>
-      <w:r>
-        <w:rPr>
-          <w:rFonts w:ascii="Consolas" w:cs="Consolas" w:eastAsia="Consolas" w:hAnsi="Consolas"/>
-          <w:color w:val="1E3A5F"/>
-          <w:sz w:val="20"/>
-          <w:szCs w:val="20"/>
-          <w:shd w:fill="F0F4F8" w:color="auto" w:val="clear"/>
-        </w:rPr>
-        <w:t xml:space="preserve">python -m http.server 8080</w:t>
-      </w:r>
-    </w:p>
-    <w:p>
-      <w:pPr>
-        <w:spacing w:after="80"/>
-        <w:ind w:left="300"/>
-      </w:pPr>
-      <w:r>
-        <w:rPr>
-          <w:rFonts w:ascii="Segoe UI" w:cs="Segoe UI" w:eastAsia="Segoe UI" w:hAnsi="Segoe UI"/>
-          <w:b/>
-          <w:bCs/>
-          <w:color w:val="2E86DE"/>
-          <w:sz w:val="22"/>
-          <w:szCs w:val="22"/>
-        </w:rPr>
-        <w:t xml:space="preserve">3. </w:t>
-      </w:r>
-      <w:r>
-        <w:rPr>
-          <w:rFonts w:ascii="Segoe UI" w:cs="Segoe UI" w:eastAsia="Segoe UI" w:hAnsi="Segoe UI"/>
-          <w:sz w:val="22"/>
-          <w:szCs w:val="22"/>
-        </w:rPr>
         <w:t xml:space="preserve">Mở trình duyệt → http://localhost:8080</w:t>
       </w:r>
     </w:p>
@@ -733,15 +647,7 @@
           <w:sz w:val="22"/>
           <w:szCs w:val="22"/>
         </w:rPr>
-        <w:t xml:space="preserve">Camera webcam trên máy tính thường không đủ tốt để quét QR nhỏ trên CCCD. </w:t>
-      </w:r>
-      <w:r>
-        <w:rPr>
-          <w:rFonts w:ascii="Segoe UI" w:cs="Segoe UI" w:eastAsia="Segoe UI" w:hAnsi="Segoe UI"/>
-          <w:sz w:val="22"/>
-          <w:szCs w:val="22"/>
-        </w:rPr>
-        <w:t xml:space="preserve">Dùng nút 📷 để upload ảnh chụp CCCD thay vì quét trực tiếp.</w:t>
+        <w:t xml:space="preserve">Webcam desktop thường không đủ tốt cho QR nhỏ. Dùng nút 📷 upload ảnh thay vì quét camera.</w:t>
       </w:r>
     </w:p>
     <w:p>
@@ -828,7 +734,7 @@
           <w:sz w:val="22"/>
           <w:szCs w:val="22"/>
         </w:rPr>
-        <w:t xml:space="preserve">Đưa mặt sau CCCD (có mã QR) vào khung hình</w:t>
+        <w:t xml:space="preserve">Đưa mặt sau CCCD (có mã QR) vào khung hình, cách 10-15cm</w:t>
       </w:r>
     </w:p>
     <w:p>
@@ -853,7 +759,7 @@
           <w:sz w:val="22"/>
           <w:szCs w:val="22"/>
         </w:rPr>
-        <w:t xml:space="preserve">Khi nhận diện được QR: màn hình flash xanh + tiếng beep</w:t>
+        <w:t xml:space="preserve">QR nhận diện: flash xanh + beep → popup thông tin</w:t>
       </w:r>
     </w:p>
     <w:p>
@@ -878,63 +784,8 @@
           <w:sz w:val="22"/>
           <w:szCs w:val="22"/>
         </w:rPr>
-        <w:t xml:space="preserve">Popup hiện thông tin: Số CCCD, Họ tên, Ngày sinh, Giới tính, Địa chỉ, Ngày cấp</w:t>
-      </w:r>
-    </w:p>
-    <w:p>
-      <w:pPr>
-        <w:spacing w:after="80"/>
-        <w:ind w:left="300"/>
-      </w:pPr>
-      <w:r>
-        <w:rPr>
-          <w:rFonts w:ascii="Segoe UI" w:cs="Segoe UI" w:eastAsia="Segoe UI" w:hAnsi="Segoe UI"/>
-          <w:b/>
-          <w:bCs/>
-          <w:color w:val="2E86DE"/>
-          <w:sz w:val="22"/>
-          <w:szCs w:val="22"/>
-        </w:rPr>
-        <w:t xml:space="preserve">5. </w:t>
-      </w:r>
-      <w:r>
-        <w:rPr>
-          <w:rFonts w:ascii="Segoe UI" w:cs="Segoe UI" w:eastAsia="Segoe UI" w:hAnsi="Segoe UI"/>
-          <w:sz w:val="22"/>
-          <w:szCs w:val="22"/>
-        </w:rPr>
-        <w:t xml:space="preserve">Bấm "Lưu" để thêm vào danh sách, hoặc "Bỏ qua" để hủy</w:t>
-      </w:r>
-    </w:p>
-    <w:p>
-      <w:pPr>
-        <w:spacing w:after="80"/>
-        <w:ind w:left="300"/>
-      </w:pPr>
-      <w:r>
-        <w:rPr>
-          <w:rFonts w:ascii="Segoe UI" w:cs="Segoe UI" w:eastAsia="Segoe UI" w:hAnsi="Segoe UI"/>
-          <w:b/>
-          <w:bCs/>
-          <w:color w:val="2E86DE"/>
-          <w:sz w:val="22"/>
-          <w:szCs w:val="22"/>
-        </w:rPr>
-        <w:t xml:space="preserve">6. </w:t>
-      </w:r>
-      <w:r>
-        <w:rPr>
-          <w:rFonts w:ascii="Segoe UI" w:cs="Segoe UI" w:eastAsia="Segoe UI" w:hAnsi="Segoe UI"/>
-          <w:sz w:val="22"/>
-          <w:szCs w:val="22"/>
-        </w:rPr>
-        <w:t xml:space="preserve">Tiếp tục quét CCCD tiếp theo — app tự resume camera</w:t>
-      </w:r>
-    </w:p>
-    <w:p>
-      <w:pPr>
-        <w:spacing w:after="100"/>
-      </w:pPr>
+        <w:t xml:space="preserve">Bấm "Lưu" hoặc "Bỏ qua" → camera tự resume quét tiếp</w:t>
+      </w:r>
     </w:p>
     <w:p>
       <w:pPr>
@@ -950,7 +801,7 @@
           <w:sz w:val="24"/>
           <w:szCs w:val="24"/>
         </w:rPr>
-        <w:t xml:space="preserve">3.2 Upload ảnh QR (máy tính hoặc điện thoại)</w:t>
+        <w:t xml:space="preserve">3.2 Upload ảnh QR</w:t>
       </w:r>
     </w:p>
     <w:p>
@@ -975,7 +826,7 @@
           <w:sz w:val="22"/>
           <w:szCs w:val="22"/>
         </w:rPr>
-        <w:t xml:space="preserve">Bấm nút 📷 trên thanh status (bên cạnh số bản ghi)</w:t>
+        <w:t xml:space="preserve">Bấm nút 📷 trên thanh status</w:t>
       </w:r>
     </w:p>
     <w:p>
@@ -1000,63 +851,8 @@
           <w:sz w:val="22"/>
           <w:szCs w:val="22"/>
         </w:rPr>
-        <w:t xml:space="preserve">Chọn ảnh chụp mặt sau CCCD từ thư viện ảnh</w:t>
-      </w:r>
-    </w:p>
-    <w:p>
-      <w:pPr>
-        <w:spacing w:after="80"/>
-        <w:ind w:left="300"/>
-      </w:pPr>
-      <w:r>
-        <w:rPr>
-          <w:rFonts w:ascii="Segoe UI" w:cs="Segoe UI" w:eastAsia="Segoe UI" w:hAnsi="Segoe UI"/>
-          <w:b/>
-          <w:bCs/>
-          <w:color w:val="2E86DE"/>
-          <w:sz w:val="22"/>
-          <w:szCs w:val="22"/>
-        </w:rPr>
-        <w:t xml:space="preserve">3. </w:t>
-      </w:r>
-      <w:r>
-        <w:rPr>
-          <w:rFonts w:ascii="Segoe UI" w:cs="Segoe UI" w:eastAsia="Segoe UI" w:hAnsi="Segoe UI"/>
-          <w:sz w:val="22"/>
-          <w:szCs w:val="22"/>
-        </w:rPr>
-        <w:t xml:space="preserve">App tự nhận diện và decode QR trong ảnh</w:t>
-      </w:r>
-    </w:p>
-    <w:p>
-      <w:pPr>
-        <w:spacing w:after="80"/>
-        <w:ind w:left="300"/>
-      </w:pPr>
-      <w:r>
-        <w:rPr>
-          <w:rFonts w:ascii="Segoe UI" w:cs="Segoe UI" w:eastAsia="Segoe UI" w:hAnsi="Segoe UI"/>
-          <w:b/>
-          <w:bCs/>
-          <w:color w:val="2E86DE"/>
-          <w:sz w:val="22"/>
-          <w:szCs w:val="22"/>
-        </w:rPr>
-        <w:t xml:space="preserve">4. </w:t>
-      </w:r>
-      <w:r>
-        <w:rPr>
-          <w:rFonts w:ascii="Segoe UI" w:cs="Segoe UI" w:eastAsia="Segoe UI" w:hAnsi="Segoe UI"/>
-          <w:sz w:val="22"/>
-          <w:szCs w:val="22"/>
-        </w:rPr>
-        <w:t xml:space="preserve">Thông tin hiện lên popup giống quét camera</w:t>
-      </w:r>
-    </w:p>
-    <w:p>
-      <w:pPr>
-        <w:spacing w:after="100"/>
-      </w:pPr>
+        <w:t xml:space="preserve">Chọn ảnh chụp mặt sau CCCD → app tự decode QR</w:t>
+      </w:r>
     </w:p>
     <w:p>
       <w:pPr>
@@ -1097,80 +893,7 @@
           <w:sz w:val="22"/>
           <w:szCs w:val="22"/>
         </w:rPr>
-        <w:t xml:space="preserve">Sau khi quét đủ số lượng CCCD cần thiết</w:t>
-      </w:r>
-    </w:p>
-    <w:p>
-      <w:pPr>
-        <w:spacing w:after="80"/>
-        <w:ind w:left="300"/>
-      </w:pPr>
-      <w:r>
-        <w:rPr>
-          <w:rFonts w:ascii="Segoe UI" w:cs="Segoe UI" w:eastAsia="Segoe UI" w:hAnsi="Segoe UI"/>
-          <w:b/>
-          <w:bCs/>
-          <w:color w:val="2E86DE"/>
-          <w:sz w:val="22"/>
-          <w:szCs w:val="22"/>
-        </w:rPr>
-        <w:t xml:space="preserve">2. </w:t>
-      </w:r>
-      <w:r>
-        <w:rPr>
-          <w:rFonts w:ascii="Segoe UI" w:cs="Segoe UI" w:eastAsia="Segoe UI" w:hAnsi="Segoe UI"/>
-          <w:sz w:val="22"/>
-          <w:szCs w:val="22"/>
-        </w:rPr>
-        <w:t xml:space="preserve">Bấm nút "Excel" ở footer</w:t>
-      </w:r>
-    </w:p>
-    <w:p>
-      <w:pPr>
-        <w:spacing w:after="80"/>
-        <w:ind w:left="300"/>
-      </w:pPr>
-      <w:r>
-        <w:rPr>
-          <w:rFonts w:ascii="Segoe UI" w:cs="Segoe UI" w:eastAsia="Segoe UI" w:hAnsi="Segoe UI"/>
-          <w:b/>
-          <w:bCs/>
-          <w:color w:val="2E86DE"/>
-          <w:sz w:val="22"/>
-          <w:szCs w:val="22"/>
-        </w:rPr>
-        <w:t xml:space="preserve">3. </w:t>
-      </w:r>
-      <w:r>
-        <w:rPr>
-          <w:rFonts w:ascii="Segoe UI" w:cs="Segoe UI" w:eastAsia="Segoe UI" w:hAnsi="Segoe UI"/>
-          <w:sz w:val="22"/>
-          <w:szCs w:val="22"/>
-        </w:rPr>
-        <w:t xml:space="preserve">File .xlsx tự tải về máy (thư mục Downloads)</w:t>
-      </w:r>
-    </w:p>
-    <w:p>
-      <w:pPr>
-        <w:spacing w:after="100"/>
-      </w:pPr>
-      <w:r>
-        <w:rPr>
-          <w:rFonts w:ascii="Segoe UI" w:cs="Segoe UI" w:eastAsia="Segoe UI" w:hAnsi="Segoe UI"/>
-          <w:sz w:val="22"/>
-          <w:szCs w:val="22"/>
-        </w:rPr>
-        <w:t xml:space="preserve">Tên file: </w:t>
-      </w:r>
-      <w:r>
-        <w:rPr>
-          <w:rFonts w:ascii="Consolas" w:cs="Consolas" w:eastAsia="Consolas" w:hAnsi="Consolas"/>
-          <w:color w:val="1E3A5F"/>
-          <w:sz w:val="20"/>
-          <w:szCs w:val="20"/>
-          <w:shd w:fill="F0F4F8" w:color="auto" w:val="clear"/>
-        </w:rPr>
-        <w:t xml:space="preserve">CCCD_scan_YYYYMMDD_HHmm.xlsx</w:t>
+        <w:t xml:space="preserve">Bấm nút "Excel" ở footer → file .xlsx tải về thư mục Downloads</w:t>
       </w:r>
     </w:p>
     <w:p>
@@ -1183,7 +906,7 @@
           <w:sz w:val="22"/>
           <w:szCs w:val="22"/>
         </w:rPr>
-        <w:t xml:space="preserve">Cột trong file: STT | Dữ liệu gốc | Số CCCD | Họ và tên | Năm sinh | Giới tính | Địa chỉ | Ngày cấp | Ngày quét</w:t>
+        <w:t xml:space="preserve">Cột: STT | Dữ liệu gốc | Số CCCD | Họ và tên | Năm sinh | Giới tính | Địa chỉ | Ngày cấp | Ngày quét</w:t>
       </w:r>
     </w:p>
     <w:p>
@@ -1206,19 +929,6 @@
     <w:p>
       <w:pPr>
         <w:spacing w:after="80"/>
-      </w:pPr>
-      <w:r>
-        <w:rPr>
-          <w:rFonts w:ascii="Segoe UI" w:cs="Segoe UI" w:eastAsia="Segoe UI" w:hAnsi="Segoe UI"/>
-          <w:sz w:val="22"/>
-          <w:szCs w:val="22"/>
-        </w:rPr>
-        <w:t xml:space="preserve">Để đẩy dữ liệu trực tiếp lên Google Sheets, cần cài đặt Google Apps Script một lần (xem Phần 4).</w:t>
-      </w:r>
-    </w:p>
-    <w:p>
-      <w:pPr>
-        <w:spacing w:after="80"/>
         <w:ind w:left="300"/>
       </w:pPr>
       <w:r>
@@ -1238,7 +948,7 @@
           <w:sz w:val="22"/>
           <w:szCs w:val="22"/>
         </w:rPr>
-        <w:t xml:space="preserve">Bấm nút "GG Sheets" ở footer</w:t>
+        <w:t xml:space="preserve">Bấm nút "GG Sheets" ở footer → dữ liệu tự đẩy lên sheet "VA"</w:t>
       </w:r>
     </w:p>
     <w:p>
@@ -1263,63 +973,8 @@
           <w:sz w:val="22"/>
           <w:szCs w:val="22"/>
         </w:rPr>
-        <w:t xml:space="preserve">Lần đầu: app hỏi URL Apps Script — dán URL đã deploy (xem Phần 4)</w:t>
-      </w:r>
-    </w:p>
-    <w:p>
-      <w:pPr>
-        <w:spacing w:after="80"/>
-        <w:ind w:left="300"/>
-      </w:pPr>
-      <w:r>
-        <w:rPr>
-          <w:rFonts w:ascii="Segoe UI" w:cs="Segoe UI" w:eastAsia="Segoe UI" w:hAnsi="Segoe UI"/>
-          <w:b/>
-          <w:bCs/>
-          <w:color w:val="2E86DE"/>
-          <w:sz w:val="22"/>
-          <w:szCs w:val="22"/>
-        </w:rPr>
-        <w:t xml:space="preserve">3. </w:t>
-      </w:r>
-      <w:r>
-        <w:rPr>
-          <w:rFonts w:ascii="Segoe UI" w:cs="Segoe UI" w:eastAsia="Segoe UI" w:hAnsi="Segoe UI"/>
-          <w:sz w:val="22"/>
-          <w:szCs w:val="22"/>
-        </w:rPr>
-        <w:t xml:space="preserve">Dữ liệu tự động được đẩy lên sheet "VA" trong Google Sheets của bạn</w:t>
-      </w:r>
-    </w:p>
-    <w:p>
-      <w:pPr>
-        <w:spacing w:after="80"/>
-        <w:ind w:left="300"/>
-      </w:pPr>
-      <w:r>
-        <w:rPr>
-          <w:rFonts w:ascii="Segoe UI" w:cs="Segoe UI" w:eastAsia="Segoe UI" w:hAnsi="Segoe UI"/>
-          <w:b/>
-          <w:bCs/>
-          <w:color w:val="2E86DE"/>
-          <w:sz w:val="22"/>
-          <w:szCs w:val="22"/>
-        </w:rPr>
-        <w:t xml:space="preserve">4. </w:t>
-      </w:r>
-      <w:r>
-        <w:rPr>
-          <w:rFonts w:ascii="Segoe UI" w:cs="Segoe UI" w:eastAsia="Segoe UI" w:hAnsi="Segoe UI"/>
-          <w:sz w:val="22"/>
-          <w:szCs w:val="22"/>
-        </w:rPr>
-        <w:t xml:space="preserve">Kiểm tra Google Sheets để xác nhận dữ liệu đã vào đúng</w:t>
-      </w:r>
-    </w:p>
-    <w:p>
-      <w:pPr>
-        <w:spacing w:after="100"/>
-      </w:pPr>
+        <w:t xml:space="preserve">Nếu chưa cài Apps Script: xem Phần 4 bên dưới</w:t>
+      </w:r>
     </w:p>
     <w:p>
       <w:pPr>
@@ -1351,7 +1006,7 @@
           <w:sz w:val="22"/>
           <w:szCs w:val="22"/>
         </w:rPr>
-        <w:t xml:space="preserve">Phần này hướng dẫn tạo "cầu nối" giữa app và Google Sheets của bạn, thông qua Google Apps Script.</w:t>
+        <w:t xml:space="preserve">Hướng dẫn tạo "cầu nối" giữa app và Google Sheets, qua Google Apps Script.</w:t>
       </w:r>
     </w:p>
     <w:p>
@@ -1451,7 +1106,7 @@
           <w:sz w:val="22"/>
           <w:szCs w:val="22"/>
         </w:rPr>
-        <w:t xml:space="preserve">Copy và dán đoạn code bên dưới vào:</w:t>
+        <w:t xml:space="preserve">Copy và dán đoạn code sau:</w:t>
       </w:r>
     </w:p>
     <w:p>
@@ -1472,7 +1127,7 @@
           <w:sz w:val="20"/>
           <w:szCs w:val="20"/>
         </w:rPr>
-        <w:t xml:space="preserve">--- BẮT ĐẦU CODE (copy từ dòng dưới) ---</w:t>
+        <w:t xml:space="preserve">--- BẮT ĐẦU CODE ---</w:t>
       </w:r>
     </w:p>
     <w:p>
@@ -1552,7 +1207,7 @@
           <w:szCs w:val="20"/>
           <w:shd w:fill="F0F4F8" w:color="auto" w:val="clear"/>
         </w:rPr>
-        <w:t xml:space="preserve">      "1q4uehvrZzBoAt8vNGXU2Wt4VVy2dyQTU0ZrSu3IHw_A"</w:t>
+        <w:t xml:space="preserve">      "19XlSwLO3B6TPbjxsquh2Z7cUZow4c3hBOXYfGplGYX0"</w:t>
       </w:r>
     </w:p>
     <w:p>
@@ -1616,22 +1271,6 @@
           <w:szCs w:val="20"/>
           <w:shd w:fill="F0F4F8" w:color="auto" w:val="clear"/>
         </w:rPr>
-        <w:t xml:space="preserve">    // Thêm header nếu sheet trống</w:t>
-      </w:r>
-    </w:p>
-    <w:p>
-      <w:pPr>
-        <w:spacing w:after="30"/>
-        <w:ind w:left="400"/>
-      </w:pPr>
-      <w:r>
-        <w:rPr>
-          <w:rFonts w:ascii="Consolas" w:cs="Consolas" w:eastAsia="Consolas" w:hAnsi="Consolas"/>
-          <w:color w:val="1E3A5F"/>
-          <w:sz w:val="20"/>
-          <w:szCs w:val="20"/>
-          <w:shd w:fill="F0F4F8" w:color="auto" w:val="clear"/>
-        </w:rPr>
         <w:t xml:space="preserve">    if (sheet.getLastRow() === 0) {</w:t>
       </w:r>
     </w:p>
@@ -1776,6 +1415,214 @@
           <w:szCs w:val="20"/>
           <w:shd w:fill="F0F4F8" w:color="auto" w:val="clear"/>
         </w:rPr>
+        <w:t xml:space="preserve">    data.records.forEach(function(r, i) {</w:t>
+      </w:r>
+    </w:p>
+    <w:p>
+      <w:pPr>
+        <w:spacing w:after="30"/>
+        <w:ind w:left="400"/>
+      </w:pPr>
+      <w:r>
+        <w:rPr>
+          <w:rFonts w:ascii="Consolas" w:cs="Consolas" w:eastAsia="Consolas" w:hAnsi="Consolas"/>
+          <w:color w:val="1E3A5F"/>
+          <w:sz w:val="20"/>
+          <w:szCs w:val="20"/>
+          <w:shd w:fill="F0F4F8" w:color="auto" w:val="clear"/>
+        </w:rPr>
+        <w:t xml:space="preserve">      sheet.appendRow([</w:t>
+      </w:r>
+    </w:p>
+    <w:p>
+      <w:pPr>
+        <w:spacing w:after="30"/>
+        <w:ind w:left="400"/>
+      </w:pPr>
+      <w:r>
+        <w:rPr>
+          <w:rFonts w:ascii="Consolas" w:cs="Consolas" w:eastAsia="Consolas" w:hAnsi="Consolas"/>
+          <w:color w:val="1E3A5F"/>
+          <w:sz w:val="20"/>
+          <w:szCs w:val="20"/>
+          <w:shd w:fill="F0F4F8" w:color="auto" w:val="clear"/>
+        </w:rPr>
+        <w:t xml:space="preserve">        startSTT + i,</w:t>
+      </w:r>
+    </w:p>
+    <w:p>
+      <w:pPr>
+        <w:spacing w:after="30"/>
+        <w:ind w:left="400"/>
+      </w:pPr>
+      <w:r>
+        <w:rPr>
+          <w:rFonts w:ascii="Consolas" w:cs="Consolas" w:eastAsia="Consolas" w:hAnsi="Consolas"/>
+          <w:color w:val="1E3A5F"/>
+          <w:sz w:val="20"/>
+          <w:szCs w:val="20"/>
+          <w:shd w:fill="F0F4F8" w:color="auto" w:val="clear"/>
+        </w:rPr>
+        <w:t xml:space="preserve">        r.rawData || "",</w:t>
+      </w:r>
+    </w:p>
+    <w:p>
+      <w:pPr>
+        <w:spacing w:after="30"/>
+        <w:ind w:left="400"/>
+      </w:pPr>
+      <w:r>
+        <w:rPr>
+          <w:rFonts w:ascii="Consolas" w:cs="Consolas" w:eastAsia="Consolas" w:hAnsi="Consolas"/>
+          <w:color w:val="1E3A5F"/>
+          <w:sz w:val="20"/>
+          <w:szCs w:val="20"/>
+          <w:shd w:fill="F0F4F8" w:color="auto" w:val="clear"/>
+        </w:rPr>
+        <w:t xml:space="preserve">        "'" + (r.cccd || ""),</w:t>
+      </w:r>
+    </w:p>
+    <w:p>
+      <w:pPr>
+        <w:spacing w:after="30"/>
+        <w:ind w:left="400"/>
+      </w:pPr>
+      <w:r>
+        <w:rPr>
+          <w:rFonts w:ascii="Consolas" w:cs="Consolas" w:eastAsia="Consolas" w:hAnsi="Consolas"/>
+          <w:color w:val="1E3A5F"/>
+          <w:sz w:val="20"/>
+          <w:szCs w:val="20"/>
+          <w:shd w:fill="F0F4F8" w:color="auto" w:val="clear"/>
+        </w:rPr>
+        <w:t xml:space="preserve">        r.name || "",</w:t>
+      </w:r>
+    </w:p>
+    <w:p>
+      <w:pPr>
+        <w:spacing w:after="30"/>
+        <w:ind w:left="400"/>
+      </w:pPr>
+      <w:r>
+        <w:rPr>
+          <w:rFonts w:ascii="Consolas" w:cs="Consolas" w:eastAsia="Consolas" w:hAnsi="Consolas"/>
+          <w:color w:val="1E3A5F"/>
+          <w:sz w:val="20"/>
+          <w:szCs w:val="20"/>
+          <w:shd w:fill="F0F4F8" w:color="auto" w:val="clear"/>
+        </w:rPr>
+        <w:t xml:space="preserve">        r.dob || "",</w:t>
+      </w:r>
+    </w:p>
+    <w:p>
+      <w:pPr>
+        <w:spacing w:after="30"/>
+        <w:ind w:left="400"/>
+      </w:pPr>
+      <w:r>
+        <w:rPr>
+          <w:rFonts w:ascii="Consolas" w:cs="Consolas" w:eastAsia="Consolas" w:hAnsi="Consolas"/>
+          <w:color w:val="1E3A5F"/>
+          <w:sz w:val="20"/>
+          <w:szCs w:val="20"/>
+          <w:shd w:fill="F0F4F8" w:color="auto" w:val="clear"/>
+        </w:rPr>
+        <w:t xml:space="preserve">        r.gender || "",</w:t>
+      </w:r>
+    </w:p>
+    <w:p>
+      <w:pPr>
+        <w:spacing w:after="30"/>
+        <w:ind w:left="400"/>
+      </w:pPr>
+      <w:r>
+        <w:rPr>
+          <w:rFonts w:ascii="Consolas" w:cs="Consolas" w:eastAsia="Consolas" w:hAnsi="Consolas"/>
+          <w:color w:val="1E3A5F"/>
+          <w:sz w:val="20"/>
+          <w:szCs w:val="20"/>
+          <w:shd w:fill="F0F4F8" w:color="auto" w:val="clear"/>
+        </w:rPr>
+        <w:t xml:space="preserve">        r.address || "",</w:t>
+      </w:r>
+    </w:p>
+    <w:p>
+      <w:pPr>
+        <w:spacing w:after="30"/>
+        <w:ind w:left="400"/>
+      </w:pPr>
+      <w:r>
+        <w:rPr>
+          <w:rFonts w:ascii="Consolas" w:cs="Consolas" w:eastAsia="Consolas" w:hAnsi="Consolas"/>
+          <w:color w:val="1E3A5F"/>
+          <w:sz w:val="20"/>
+          <w:szCs w:val="20"/>
+          <w:shd w:fill="F0F4F8" w:color="auto" w:val="clear"/>
+        </w:rPr>
+        <w:t xml:space="preserve">        r.issueDate || "",</w:t>
+      </w:r>
+    </w:p>
+    <w:p>
+      <w:pPr>
+        <w:spacing w:after="30"/>
+        <w:ind w:left="400"/>
+      </w:pPr>
+      <w:r>
+        <w:rPr>
+          <w:rFonts w:ascii="Consolas" w:cs="Consolas" w:eastAsia="Consolas" w:hAnsi="Consolas"/>
+          <w:color w:val="1E3A5F"/>
+          <w:sz w:val="20"/>
+          <w:szCs w:val="20"/>
+          <w:shd w:fill="F0F4F8" w:color="auto" w:val="clear"/>
+        </w:rPr>
+        <w:t xml:space="preserve">        r.scannedAt || ""</w:t>
+      </w:r>
+    </w:p>
+    <w:p>
+      <w:pPr>
+        <w:spacing w:after="30"/>
+        <w:ind w:left="400"/>
+      </w:pPr>
+      <w:r>
+        <w:rPr>
+          <w:rFonts w:ascii="Consolas" w:cs="Consolas" w:eastAsia="Consolas" w:hAnsi="Consolas"/>
+          <w:color w:val="1E3A5F"/>
+          <w:sz w:val="20"/>
+          <w:szCs w:val="20"/>
+          <w:shd w:fill="F0F4F8" w:color="auto" w:val="clear"/>
+        </w:rPr>
+        <w:t xml:space="preserve">      ]);</w:t>
+      </w:r>
+    </w:p>
+    <w:p>
+      <w:pPr>
+        <w:spacing w:after="30"/>
+        <w:ind w:left="400"/>
+      </w:pPr>
+      <w:r>
+        <w:rPr>
+          <w:rFonts w:ascii="Consolas" w:cs="Consolas" w:eastAsia="Consolas" w:hAnsi="Consolas"/>
+          <w:color w:val="1E3A5F"/>
+          <w:sz w:val="20"/>
+          <w:szCs w:val="20"/>
+          <w:shd w:fill="F0F4F8" w:color="auto" w:val="clear"/>
+        </w:rPr>
+        <w:t xml:space="preserve">    });</w:t>
+      </w:r>
+    </w:p>
+    <w:p>
+      <w:pPr>
+        <w:spacing w:after="30"/>
+        <w:ind w:left="400"/>
+      </w:pPr>
+      <w:r>
+        <w:rPr>
+          <w:rFonts w:ascii="Consolas" w:cs="Consolas" w:eastAsia="Consolas" w:hAnsi="Consolas"/>
+          <w:color w:val="1E3A5F"/>
+          <w:sz w:val="20"/>
+          <w:szCs w:val="20"/>
+          <w:shd w:fill="F0F4F8" w:color="auto" w:val="clear"/>
+        </w:rPr>
         <w:t xml:space="preserve"/>
       </w:r>
     </w:p>
@@ -1792,199 +1639,71 @@
           <w:szCs w:val="20"/>
           <w:shd w:fill="F0F4F8" w:color="auto" w:val="clear"/>
         </w:rPr>
-        <w:t xml:space="preserve">    data.records.forEach(function(r, i) {</w:t>
-      </w:r>
-    </w:p>
-    <w:p>
-      <w:pPr>
-        <w:spacing w:after="30"/>
-        <w:ind w:left="400"/>
-      </w:pPr>
-      <w:r>
-        <w:rPr>
-          <w:rFonts w:ascii="Consolas" w:cs="Consolas" w:eastAsia="Consolas" w:hAnsi="Consolas"/>
-          <w:color w:val="1E3A5F"/>
-          <w:sz w:val="20"/>
-          <w:szCs w:val="20"/>
-          <w:shd w:fill="F0F4F8" w:color="auto" w:val="clear"/>
-        </w:rPr>
-        <w:t xml:space="preserve">      sheet.appendRow([</w:t>
-      </w:r>
-    </w:p>
-    <w:p>
-      <w:pPr>
-        <w:spacing w:after="30"/>
-        <w:ind w:left="400"/>
-      </w:pPr>
-      <w:r>
-        <w:rPr>
-          <w:rFonts w:ascii="Consolas" w:cs="Consolas" w:eastAsia="Consolas" w:hAnsi="Consolas"/>
-          <w:color w:val="1E3A5F"/>
-          <w:sz w:val="20"/>
-          <w:szCs w:val="20"/>
-          <w:shd w:fill="F0F4F8" w:color="auto" w:val="clear"/>
-        </w:rPr>
-        <w:t xml:space="preserve">        startSTT + i,</w:t>
-      </w:r>
-    </w:p>
-    <w:p>
-      <w:pPr>
-        <w:spacing w:after="30"/>
-        <w:ind w:left="400"/>
-      </w:pPr>
-      <w:r>
-        <w:rPr>
-          <w:rFonts w:ascii="Consolas" w:cs="Consolas" w:eastAsia="Consolas" w:hAnsi="Consolas"/>
-          <w:color w:val="1E3A5F"/>
-          <w:sz w:val="20"/>
-          <w:szCs w:val="20"/>
-          <w:shd w:fill="F0F4F8" w:color="auto" w:val="clear"/>
-        </w:rPr>
-        <w:t xml:space="preserve">        r.rawData || "",</w:t>
-      </w:r>
-    </w:p>
-    <w:p>
-      <w:pPr>
-        <w:spacing w:after="30"/>
-        <w:ind w:left="400"/>
-      </w:pPr>
-      <w:r>
-        <w:rPr>
-          <w:rFonts w:ascii="Consolas" w:cs="Consolas" w:eastAsia="Consolas" w:hAnsi="Consolas"/>
-          <w:color w:val="1E3A5F"/>
-          <w:sz w:val="20"/>
-          <w:szCs w:val="20"/>
-          <w:shd w:fill="F0F4F8" w:color="auto" w:val="clear"/>
-        </w:rPr>
-        <w:t xml:space="preserve">        "'" + (r.cccd || ""),</w:t>
-      </w:r>
-    </w:p>
-    <w:p>
-      <w:pPr>
-        <w:spacing w:after="30"/>
-        <w:ind w:left="400"/>
-      </w:pPr>
-      <w:r>
-        <w:rPr>
-          <w:rFonts w:ascii="Consolas" w:cs="Consolas" w:eastAsia="Consolas" w:hAnsi="Consolas"/>
-          <w:color w:val="1E3A5F"/>
-          <w:sz w:val="20"/>
-          <w:szCs w:val="20"/>
-          <w:shd w:fill="F0F4F8" w:color="auto" w:val="clear"/>
-        </w:rPr>
-        <w:t xml:space="preserve">        r.name || "",</w:t>
-      </w:r>
-    </w:p>
-    <w:p>
-      <w:pPr>
-        <w:spacing w:after="30"/>
-        <w:ind w:left="400"/>
-      </w:pPr>
-      <w:r>
-        <w:rPr>
-          <w:rFonts w:ascii="Consolas" w:cs="Consolas" w:eastAsia="Consolas" w:hAnsi="Consolas"/>
-          <w:color w:val="1E3A5F"/>
-          <w:sz w:val="20"/>
-          <w:szCs w:val="20"/>
-          <w:shd w:fill="F0F4F8" w:color="auto" w:val="clear"/>
-        </w:rPr>
-        <w:t xml:space="preserve">        r.dob || "",</w:t>
-      </w:r>
-    </w:p>
-    <w:p>
-      <w:pPr>
-        <w:spacing w:after="30"/>
-        <w:ind w:left="400"/>
-      </w:pPr>
-      <w:r>
-        <w:rPr>
-          <w:rFonts w:ascii="Consolas" w:cs="Consolas" w:eastAsia="Consolas" w:hAnsi="Consolas"/>
-          <w:color w:val="1E3A5F"/>
-          <w:sz w:val="20"/>
-          <w:szCs w:val="20"/>
-          <w:shd w:fill="F0F4F8" w:color="auto" w:val="clear"/>
-        </w:rPr>
-        <w:t xml:space="preserve">        r.gender || "",</w:t>
-      </w:r>
-    </w:p>
-    <w:p>
-      <w:pPr>
-        <w:spacing w:after="30"/>
-        <w:ind w:left="400"/>
-      </w:pPr>
-      <w:r>
-        <w:rPr>
-          <w:rFonts w:ascii="Consolas" w:cs="Consolas" w:eastAsia="Consolas" w:hAnsi="Consolas"/>
-          <w:color w:val="1E3A5F"/>
-          <w:sz w:val="20"/>
-          <w:szCs w:val="20"/>
-          <w:shd w:fill="F0F4F8" w:color="auto" w:val="clear"/>
-        </w:rPr>
-        <w:t xml:space="preserve">        r.address || "",</w:t>
-      </w:r>
-    </w:p>
-    <w:p>
-      <w:pPr>
-        <w:spacing w:after="30"/>
-        <w:ind w:left="400"/>
-      </w:pPr>
-      <w:r>
-        <w:rPr>
-          <w:rFonts w:ascii="Consolas" w:cs="Consolas" w:eastAsia="Consolas" w:hAnsi="Consolas"/>
-          <w:color w:val="1E3A5F"/>
-          <w:sz w:val="20"/>
-          <w:szCs w:val="20"/>
-          <w:shd w:fill="F0F4F8" w:color="auto" w:val="clear"/>
-        </w:rPr>
-        <w:t xml:space="preserve">        r.issueDate || "",</w:t>
-      </w:r>
-    </w:p>
-    <w:p>
-      <w:pPr>
-        <w:spacing w:after="30"/>
-        <w:ind w:left="400"/>
-      </w:pPr>
-      <w:r>
-        <w:rPr>
-          <w:rFonts w:ascii="Consolas" w:cs="Consolas" w:eastAsia="Consolas" w:hAnsi="Consolas"/>
-          <w:color w:val="1E3A5F"/>
-          <w:sz w:val="20"/>
-          <w:szCs w:val="20"/>
-          <w:shd w:fill="F0F4F8" w:color="auto" w:val="clear"/>
-        </w:rPr>
-        <w:t xml:space="preserve">        r.scannedAt || ""</w:t>
-      </w:r>
-    </w:p>
-    <w:p>
-      <w:pPr>
-        <w:spacing w:after="30"/>
-        <w:ind w:left="400"/>
-      </w:pPr>
-      <w:r>
-        <w:rPr>
-          <w:rFonts w:ascii="Consolas" w:cs="Consolas" w:eastAsia="Consolas" w:hAnsi="Consolas"/>
-          <w:color w:val="1E3A5F"/>
-          <w:sz w:val="20"/>
-          <w:szCs w:val="20"/>
-          <w:shd w:fill="F0F4F8" w:color="auto" w:val="clear"/>
-        </w:rPr>
-        <w:t xml:space="preserve">      ]);</w:t>
-      </w:r>
-    </w:p>
-    <w:p>
-      <w:pPr>
-        <w:spacing w:after="30"/>
-        <w:ind w:left="400"/>
-      </w:pPr>
-      <w:r>
-        <w:rPr>
-          <w:rFonts w:ascii="Consolas" w:cs="Consolas" w:eastAsia="Consolas" w:hAnsi="Consolas"/>
-          <w:color w:val="1E3A5F"/>
-          <w:sz w:val="20"/>
-          <w:szCs w:val="20"/>
-          <w:shd w:fill="F0F4F8" w:color="auto" w:val="clear"/>
-        </w:rPr>
-        <w:t xml:space="preserve">    });</w:t>
+        <w:t xml:space="preserve">    var range = sheet.getRange(</w:t>
+      </w:r>
+    </w:p>
+    <w:p>
+      <w:pPr>
+        <w:spacing w:after="30"/>
+        <w:ind w:left="400"/>
+      </w:pPr>
+      <w:r>
+        <w:rPr>
+          <w:rFonts w:ascii="Consolas" w:cs="Consolas" w:eastAsia="Consolas" w:hAnsi="Consolas"/>
+          <w:color w:val="1E3A5F"/>
+          <w:sz w:val="20"/>
+          <w:szCs w:val="20"/>
+          <w:shd w:fill="F0F4F8" w:color="auto" w:val="clear"/>
+        </w:rPr>
+        <w:t xml:space="preserve">      startSTT + 1, 3,</w:t>
+      </w:r>
+    </w:p>
+    <w:p>
+      <w:pPr>
+        <w:spacing w:after="30"/>
+        <w:ind w:left="400"/>
+      </w:pPr>
+      <w:r>
+        <w:rPr>
+          <w:rFonts w:ascii="Consolas" w:cs="Consolas" w:eastAsia="Consolas" w:hAnsi="Consolas"/>
+          <w:color w:val="1E3A5F"/>
+          <w:sz w:val="20"/>
+          <w:szCs w:val="20"/>
+          <w:shd w:fill="F0F4F8" w:color="auto" w:val="clear"/>
+        </w:rPr>
+        <w:t xml:space="preserve">      data.records.length, 1</w:t>
+      </w:r>
+    </w:p>
+    <w:p>
+      <w:pPr>
+        <w:spacing w:after="30"/>
+        <w:ind w:left="400"/>
+      </w:pPr>
+      <w:r>
+        <w:rPr>
+          <w:rFonts w:ascii="Consolas" w:cs="Consolas" w:eastAsia="Consolas" w:hAnsi="Consolas"/>
+          <w:color w:val="1E3A5F"/>
+          <w:sz w:val="20"/>
+          <w:szCs w:val="20"/>
+          <w:shd w:fill="F0F4F8" w:color="auto" w:val="clear"/>
+        </w:rPr>
+        <w:t xml:space="preserve">    );</w:t>
+      </w:r>
+    </w:p>
+    <w:p>
+      <w:pPr>
+        <w:spacing w:after="30"/>
+        <w:ind w:left="400"/>
+      </w:pPr>
+      <w:r>
+        <w:rPr>
+          <w:rFonts w:ascii="Consolas" w:cs="Consolas" w:eastAsia="Consolas" w:hAnsi="Consolas"/>
+          <w:color w:val="1E3A5F"/>
+          <w:sz w:val="20"/>
+          <w:szCs w:val="20"/>
+          <w:shd w:fill="F0F4F8" w:color="auto" w:val="clear"/>
+        </w:rPr>
+        <w:t xml:space="preserve">    range.setNumberFormat("@");</w:t>
       </w:r>
     </w:p>
     <w:p>
@@ -2016,118 +1735,6 @@
           <w:szCs w:val="20"/>
           <w:shd w:fill="F0F4F8" w:color="auto" w:val="clear"/>
         </w:rPr>
-        <w:t xml:space="preserve">    // Format cột CCCD là text</w:t>
-      </w:r>
-    </w:p>
-    <w:p>
-      <w:pPr>
-        <w:spacing w:after="30"/>
-        <w:ind w:left="400"/>
-      </w:pPr>
-      <w:r>
-        <w:rPr>
-          <w:rFonts w:ascii="Consolas" w:cs="Consolas" w:eastAsia="Consolas" w:hAnsi="Consolas"/>
-          <w:color w:val="1E3A5F"/>
-          <w:sz w:val="20"/>
-          <w:szCs w:val="20"/>
-          <w:shd w:fill="F0F4F8" w:color="auto" w:val="clear"/>
-        </w:rPr>
-        <w:t xml:space="preserve">    var range = sheet.getRange(</w:t>
-      </w:r>
-    </w:p>
-    <w:p>
-      <w:pPr>
-        <w:spacing w:after="30"/>
-        <w:ind w:left="400"/>
-      </w:pPr>
-      <w:r>
-        <w:rPr>
-          <w:rFonts w:ascii="Consolas" w:cs="Consolas" w:eastAsia="Consolas" w:hAnsi="Consolas"/>
-          <w:color w:val="1E3A5F"/>
-          <w:sz w:val="20"/>
-          <w:szCs w:val="20"/>
-          <w:shd w:fill="F0F4F8" w:color="auto" w:val="clear"/>
-        </w:rPr>
-        <w:t xml:space="preserve">      startSTT + 1, 3,</w:t>
-      </w:r>
-    </w:p>
-    <w:p>
-      <w:pPr>
-        <w:spacing w:after="30"/>
-        <w:ind w:left="400"/>
-      </w:pPr>
-      <w:r>
-        <w:rPr>
-          <w:rFonts w:ascii="Consolas" w:cs="Consolas" w:eastAsia="Consolas" w:hAnsi="Consolas"/>
-          <w:color w:val="1E3A5F"/>
-          <w:sz w:val="20"/>
-          <w:szCs w:val="20"/>
-          <w:shd w:fill="F0F4F8" w:color="auto" w:val="clear"/>
-        </w:rPr>
-        <w:t xml:space="preserve">      data.records.length, 1</w:t>
-      </w:r>
-    </w:p>
-    <w:p>
-      <w:pPr>
-        <w:spacing w:after="30"/>
-        <w:ind w:left="400"/>
-      </w:pPr>
-      <w:r>
-        <w:rPr>
-          <w:rFonts w:ascii="Consolas" w:cs="Consolas" w:eastAsia="Consolas" w:hAnsi="Consolas"/>
-          <w:color w:val="1E3A5F"/>
-          <w:sz w:val="20"/>
-          <w:szCs w:val="20"/>
-          <w:shd w:fill="F0F4F8" w:color="auto" w:val="clear"/>
-        </w:rPr>
-        <w:t xml:space="preserve">    );</w:t>
-      </w:r>
-    </w:p>
-    <w:p>
-      <w:pPr>
-        <w:spacing w:after="30"/>
-        <w:ind w:left="400"/>
-      </w:pPr>
-      <w:r>
-        <w:rPr>
-          <w:rFonts w:ascii="Consolas" w:cs="Consolas" w:eastAsia="Consolas" w:hAnsi="Consolas"/>
-          <w:color w:val="1E3A5F"/>
-          <w:sz w:val="20"/>
-          <w:szCs w:val="20"/>
-          <w:shd w:fill="F0F4F8" w:color="auto" w:val="clear"/>
-        </w:rPr>
-        <w:t xml:space="preserve">    range.setNumberFormat("@");</w:t>
-      </w:r>
-    </w:p>
-    <w:p>
-      <w:pPr>
-        <w:spacing w:after="30"/>
-        <w:ind w:left="400"/>
-      </w:pPr>
-      <w:r>
-        <w:rPr>
-          <w:rFonts w:ascii="Consolas" w:cs="Consolas" w:eastAsia="Consolas" w:hAnsi="Consolas"/>
-          <w:color w:val="1E3A5F"/>
-          <w:sz w:val="20"/>
-          <w:szCs w:val="20"/>
-          <w:shd w:fill="F0F4F8" w:color="auto" w:val="clear"/>
-        </w:rPr>
-        <w:t xml:space="preserve"/>
-      </w:r>
-    </w:p>
-    <w:p>
-      <w:pPr>
-        <w:spacing w:after="30"/>
-        <w:ind w:left="400"/>
-      </w:pPr>
-      <w:r>
-        <w:rPr>
-          <w:rFonts w:ascii="Consolas" w:cs="Consolas" w:eastAsia="Consolas" w:hAnsi="Consolas"/>
-          <w:color w:val="1E3A5F"/>
-          <w:sz w:val="20"/>
-          <w:szCs w:val="20"/>
-          <w:shd w:fill="F0F4F8" w:color="auto" w:val="clear"/>
-        </w:rPr>
         <w:t xml:space="preserve">    return ContentService</w:t>
       </w:r>
     </w:p>
@@ -2144,87 +1751,55 @@
           <w:szCs w:val="20"/>
           <w:shd w:fill="F0F4F8" w:color="auto" w:val="clear"/>
         </w:rPr>
-        <w:t xml:space="preserve">      .createTextOutput(</w:t>
-      </w:r>
-    </w:p>
-    <w:p>
-      <w:pPr>
-        <w:spacing w:after="30"/>
-        <w:ind w:left="400"/>
-      </w:pPr>
-      <w:r>
-        <w:rPr>
-          <w:rFonts w:ascii="Consolas" w:cs="Consolas" w:eastAsia="Consolas" w:hAnsi="Consolas"/>
-          <w:color w:val="1E3A5F"/>
-          <w:sz w:val="20"/>
-          <w:szCs w:val="20"/>
-          <w:shd w:fill="F0F4F8" w:color="auto" w:val="clear"/>
-        </w:rPr>
-        <w:t xml:space="preserve">        JSON.stringify({</w:t>
-      </w:r>
-    </w:p>
-    <w:p>
-      <w:pPr>
-        <w:spacing w:after="30"/>
-        <w:ind w:left="400"/>
-      </w:pPr>
-      <w:r>
-        <w:rPr>
-          <w:rFonts w:ascii="Consolas" w:cs="Consolas" w:eastAsia="Consolas" w:hAnsi="Consolas"/>
-          <w:color w:val="1E3A5F"/>
-          <w:sz w:val="20"/>
-          <w:szCs w:val="20"/>
-          <w:shd w:fill="F0F4F8" w:color="auto" w:val="clear"/>
-        </w:rPr>
-        <w:t xml:space="preserve">          success: true,</w:t>
-      </w:r>
-    </w:p>
-    <w:p>
-      <w:pPr>
-        <w:spacing w:after="30"/>
-        <w:ind w:left="400"/>
-      </w:pPr>
-      <w:r>
-        <w:rPr>
-          <w:rFonts w:ascii="Consolas" w:cs="Consolas" w:eastAsia="Consolas" w:hAnsi="Consolas"/>
-          <w:color w:val="1E3A5F"/>
-          <w:sz w:val="20"/>
-          <w:szCs w:val="20"/>
-          <w:shd w:fill="F0F4F8" w:color="auto" w:val="clear"/>
-        </w:rPr>
-        <w:t xml:space="preserve">          count: data.records.length</w:t>
-      </w:r>
-    </w:p>
-    <w:p>
-      <w:pPr>
-        <w:spacing w:after="30"/>
-        <w:ind w:left="400"/>
-      </w:pPr>
-      <w:r>
-        <w:rPr>
-          <w:rFonts w:ascii="Consolas" w:cs="Consolas" w:eastAsia="Consolas" w:hAnsi="Consolas"/>
-          <w:color w:val="1E3A5F"/>
-          <w:sz w:val="20"/>
-          <w:szCs w:val="20"/>
-          <w:shd w:fill="F0F4F8" w:color="auto" w:val="clear"/>
-        </w:rPr>
-        <w:t xml:space="preserve">        })</w:t>
-      </w:r>
-    </w:p>
-    <w:p>
-      <w:pPr>
-        <w:spacing w:after="30"/>
-        <w:ind w:left="400"/>
-      </w:pPr>
-      <w:r>
-        <w:rPr>
-          <w:rFonts w:ascii="Consolas" w:cs="Consolas" w:eastAsia="Consolas" w:hAnsi="Consolas"/>
-          <w:color w:val="1E3A5F"/>
-          <w:sz w:val="20"/>
-          <w:szCs w:val="20"/>
-          <w:shd w:fill="F0F4F8" w:color="auto" w:val="clear"/>
-        </w:rPr>
-        <w:t xml:space="preserve">      )</w:t>
+        <w:t xml:space="preserve">      .createTextOutput(JSON.stringify({</w:t>
+      </w:r>
+    </w:p>
+    <w:p>
+      <w:pPr>
+        <w:spacing w:after="30"/>
+        <w:ind w:left="400"/>
+      </w:pPr>
+      <w:r>
+        <w:rPr>
+          <w:rFonts w:ascii="Consolas" w:cs="Consolas" w:eastAsia="Consolas" w:hAnsi="Consolas"/>
+          <w:color w:val="1E3A5F"/>
+          <w:sz w:val="20"/>
+          <w:szCs w:val="20"/>
+          <w:shd w:fill="F0F4F8" w:color="auto" w:val="clear"/>
+        </w:rPr>
+        <w:t xml:space="preserve">        success: true,</w:t>
+      </w:r>
+    </w:p>
+    <w:p>
+      <w:pPr>
+        <w:spacing w:after="30"/>
+        <w:ind w:left="400"/>
+      </w:pPr>
+      <w:r>
+        <w:rPr>
+          <w:rFonts w:ascii="Consolas" w:cs="Consolas" w:eastAsia="Consolas" w:hAnsi="Consolas"/>
+          <w:color w:val="1E3A5F"/>
+          <w:sz w:val="20"/>
+          <w:szCs w:val="20"/>
+          <w:shd w:fill="F0F4F8" w:color="auto" w:val="clear"/>
+        </w:rPr>
+        <w:t xml:space="preserve">        count: data.records.length</w:t>
+      </w:r>
+    </w:p>
+    <w:p>
+      <w:pPr>
+        <w:spacing w:after="30"/>
+        <w:ind w:left="400"/>
+      </w:pPr>
+      <w:r>
+        <w:rPr>
+          <w:rFonts w:ascii="Consolas" w:cs="Consolas" w:eastAsia="Consolas" w:hAnsi="Consolas"/>
+          <w:color w:val="1E3A5F"/>
+          <w:sz w:val="20"/>
+          <w:szCs w:val="20"/>
+          <w:shd w:fill="F0F4F8" w:color="auto" w:val="clear"/>
+        </w:rPr>
+        <w:t xml:space="preserve">      }))</w:t>
       </w:r>
     </w:p>
     <w:p>
@@ -2256,22 +1831,6 @@
           <w:szCs w:val="20"/>
           <w:shd w:fill="F0F4F8" w:color="auto" w:val="clear"/>
         </w:rPr>
-        <w:t xml:space="preserve"/>
-      </w:r>
-    </w:p>
-    <w:p>
-      <w:pPr>
-        <w:spacing w:after="30"/>
-        <w:ind w:left="400"/>
-      </w:pPr>
-      <w:r>
-        <w:rPr>
-          <w:rFonts w:ascii="Consolas" w:cs="Consolas" w:eastAsia="Consolas" w:hAnsi="Consolas"/>
-          <w:color w:val="1E3A5F"/>
-          <w:sz w:val="20"/>
-          <w:szCs w:val="20"/>
-          <w:shd w:fill="F0F4F8" w:color="auto" w:val="clear"/>
-        </w:rPr>
         <w:t xml:space="preserve">  } catch (err) {</w:t>
       </w:r>
     </w:p>
@@ -2304,87 +1863,39 @@
           <w:szCs w:val="20"/>
           <w:shd w:fill="F0F4F8" w:color="auto" w:val="clear"/>
         </w:rPr>
-        <w:t xml:space="preserve">      .createTextOutput(</w:t>
-      </w:r>
-    </w:p>
-    <w:p>
-      <w:pPr>
-        <w:spacing w:after="30"/>
-        <w:ind w:left="400"/>
-      </w:pPr>
-      <w:r>
-        <w:rPr>
-          <w:rFonts w:ascii="Consolas" w:cs="Consolas" w:eastAsia="Consolas" w:hAnsi="Consolas"/>
-          <w:color w:val="1E3A5F"/>
-          <w:sz w:val="20"/>
-          <w:szCs w:val="20"/>
-          <w:shd w:fill="F0F4F8" w:color="auto" w:val="clear"/>
-        </w:rPr>
-        <w:t xml:space="preserve">        JSON.stringify({</w:t>
-      </w:r>
-    </w:p>
-    <w:p>
-      <w:pPr>
-        <w:spacing w:after="30"/>
-        <w:ind w:left="400"/>
-      </w:pPr>
-      <w:r>
-        <w:rPr>
-          <w:rFonts w:ascii="Consolas" w:cs="Consolas" w:eastAsia="Consolas" w:hAnsi="Consolas"/>
-          <w:color w:val="1E3A5F"/>
-          <w:sz w:val="20"/>
-          <w:szCs w:val="20"/>
-          <w:shd w:fill="F0F4F8" w:color="auto" w:val="clear"/>
-        </w:rPr>
-        <w:t xml:space="preserve">          success: false,</w:t>
-      </w:r>
-    </w:p>
-    <w:p>
-      <w:pPr>
-        <w:spacing w:after="30"/>
-        <w:ind w:left="400"/>
-      </w:pPr>
-      <w:r>
-        <w:rPr>
-          <w:rFonts w:ascii="Consolas" w:cs="Consolas" w:eastAsia="Consolas" w:hAnsi="Consolas"/>
-          <w:color w:val="1E3A5F"/>
-          <w:sz w:val="20"/>
-          <w:szCs w:val="20"/>
-          <w:shd w:fill="F0F4F8" w:color="auto" w:val="clear"/>
-        </w:rPr>
-        <w:t xml:space="preserve">          error: err.message</w:t>
-      </w:r>
-    </w:p>
-    <w:p>
-      <w:pPr>
-        <w:spacing w:after="30"/>
-        <w:ind w:left="400"/>
-      </w:pPr>
-      <w:r>
-        <w:rPr>
-          <w:rFonts w:ascii="Consolas" w:cs="Consolas" w:eastAsia="Consolas" w:hAnsi="Consolas"/>
-          <w:color w:val="1E3A5F"/>
-          <w:sz w:val="20"/>
-          <w:szCs w:val="20"/>
-          <w:shd w:fill="F0F4F8" w:color="auto" w:val="clear"/>
-        </w:rPr>
-        <w:t xml:space="preserve">        })</w:t>
-      </w:r>
-    </w:p>
-    <w:p>
-      <w:pPr>
-        <w:spacing w:after="30"/>
-        <w:ind w:left="400"/>
-      </w:pPr>
-      <w:r>
-        <w:rPr>
-          <w:rFonts w:ascii="Consolas" w:cs="Consolas" w:eastAsia="Consolas" w:hAnsi="Consolas"/>
-          <w:color w:val="1E3A5F"/>
-          <w:sz w:val="20"/>
-          <w:szCs w:val="20"/>
-          <w:shd w:fill="F0F4F8" w:color="auto" w:val="clear"/>
-        </w:rPr>
-        <w:t xml:space="preserve">      )</w:t>
+        <w:t xml:space="preserve">      .createTextOutput(JSON.stringify({</w:t>
+      </w:r>
+    </w:p>
+    <w:p>
+      <w:pPr>
+        <w:spacing w:after="30"/>
+        <w:ind w:left="400"/>
+      </w:pPr>
+      <w:r>
+        <w:rPr>
+          <w:rFonts w:ascii="Consolas" w:cs="Consolas" w:eastAsia="Consolas" w:hAnsi="Consolas"/>
+          <w:color w:val="1E3A5F"/>
+          <w:sz w:val="20"/>
+          <w:szCs w:val="20"/>
+          <w:shd w:fill="F0F4F8" w:color="auto" w:val="clear"/>
+        </w:rPr>
+        <w:t xml:space="preserve">        success: false, error: err.message</w:t>
+      </w:r>
+    </w:p>
+    <w:p>
+      <w:pPr>
+        <w:spacing w:after="30"/>
+        <w:ind w:left="400"/>
+      </w:pPr>
+      <w:r>
+        <w:rPr>
+          <w:rFonts w:ascii="Consolas" w:cs="Consolas" w:eastAsia="Consolas" w:hAnsi="Consolas"/>
+          <w:color w:val="1E3A5F"/>
+          <w:sz w:val="20"/>
+          <w:szCs w:val="20"/>
+          <w:shd w:fill="F0F4F8" w:color="auto" w:val="clear"/>
+        </w:rPr>
+        <w:t xml:space="preserve">      }))</w:t>
       </w:r>
     </w:p>
     <w:p>
@@ -2473,7 +1984,7 @@
           <w:sz w:val="22"/>
           <w:szCs w:val="22"/>
         </w:rPr>
-        <w:t xml:space="preserve">Bấm menu "Triển khai" (Deploy) → "Triển khai mới" (New deployment)</w:t>
+        <w:t xml:space="preserve">Bấm "Triển khai" (Deploy) → "Triển khai mới" (New deployment)</w:t>
       </w:r>
     </w:p>
     <w:p>
@@ -2576,105 +2087,89 @@
           <w:sz w:val="22"/>
           <w:szCs w:val="22"/>
         </w:rPr>
-        <w:t xml:space="preserve">Bấm "Triển khai" (Deploy)</w:t>
-      </w:r>
-    </w:p>
-    <w:p>
-      <w:pPr>
-        <w:spacing w:after="80"/>
-        <w:ind w:left="300"/>
-      </w:pPr>
-      <w:r>
-        <w:rPr>
-          <w:rFonts w:ascii="Segoe UI" w:cs="Segoe UI" w:eastAsia="Segoe UI" w:hAnsi="Segoe UI"/>
-          <w:b/>
-          <w:bCs/>
-          <w:color w:val="2E86DE"/>
-          <w:sz w:val="22"/>
-          <w:szCs w:val="22"/>
-        </w:rPr>
-        <w:t xml:space="preserve">9. </w:t>
-      </w:r>
-      <w:r>
-        <w:rPr>
-          <w:rFonts w:ascii="Segoe UI" w:cs="Segoe UI" w:eastAsia="Segoe UI" w:hAnsi="Segoe UI"/>
-          <w:sz w:val="22"/>
-          <w:szCs w:val="22"/>
-        </w:rPr>
-        <w:t xml:space="preserve">Google sẽ yêu cầu cấp quyền → Bấm "Ủy quyền" (Authorize) → chọn tài khoản Google</w:t>
-      </w:r>
-    </w:p>
-    <w:p>
-      <w:pPr>
-        <w:spacing w:after="80"/>
-        <w:ind w:left="300"/>
-      </w:pPr>
-      <w:r>
-        <w:rPr>
-          <w:rFonts w:ascii="Segoe UI" w:cs="Segoe UI" w:eastAsia="Segoe UI" w:hAnsi="Segoe UI"/>
-          <w:b/>
-          <w:bCs/>
-          <w:color w:val="2E86DE"/>
-          <w:sz w:val="22"/>
-          <w:szCs w:val="22"/>
-        </w:rPr>
-        <w:t xml:space="preserve">10. </w:t>
-      </w:r>
-      <w:r>
-        <w:rPr>
-          <w:rFonts w:ascii="Segoe UI" w:cs="Segoe UI" w:eastAsia="Segoe UI" w:hAnsi="Segoe UI"/>
-          <w:sz w:val="22"/>
-          <w:szCs w:val="22"/>
-        </w:rPr>
-        <w:t xml:space="preserve">Copy URL triển khai (dạng https://script.google.com/macros/s/...../exec)</w:t>
-      </w:r>
-    </w:p>
-    <w:p>
-      <w:pPr>
-        <w:spacing w:after="80"/>
-        <w:ind w:left="300"/>
-      </w:pPr>
-      <w:r>
-        <w:rPr>
-          <w:rFonts w:ascii="Segoe UI" w:cs="Segoe UI" w:eastAsia="Segoe UI" w:hAnsi="Segoe UI"/>
-          <w:b/>
-          <w:bCs/>
-          <w:color w:val="2E86DE"/>
-          <w:sz w:val="22"/>
-          <w:szCs w:val="22"/>
-        </w:rPr>
-        <w:t xml:space="preserve">11. </w:t>
-      </w:r>
-      <w:r>
-        <w:rPr>
-          <w:rFonts w:ascii="Segoe UI" w:cs="Segoe UI" w:eastAsia="Segoe UI" w:hAnsi="Segoe UI"/>
-          <w:sz w:val="22"/>
-          <w:szCs w:val="22"/>
-        </w:rPr>
-        <w:t xml:space="preserve">Trong app CCCD Scanner: bấm nút "GG Sheets" → dán URL vừa copy</w:t>
-      </w:r>
-    </w:p>
-    <w:p>
-      <w:pPr>
-        <w:spacing w:after="200" w:before="100"/>
-      </w:pPr>
-      <w:r>
-        <w:rPr>
-          <w:rFonts w:ascii="Segoe UI" w:cs="Segoe UI" w:eastAsia="Segoe UI" w:hAnsi="Segoe UI"/>
-          <w:b/>
-          <w:bCs/>
-          <w:sz w:val="22"/>
-          <w:szCs w:val="22"/>
-        </w:rPr>
-        <w:t xml:space="preserve">Xong! </w:t>
-      </w:r>
-      <w:r>
-        <w:rPr>
-          <w:rFonts w:ascii="Segoe UI" w:cs="Segoe UI" w:eastAsia="Segoe UI" w:hAnsi="Segoe UI"/>
-          <w:sz w:val="22"/>
-          <w:szCs w:val="22"/>
-        </w:rPr>
-        <w:t xml:space="preserve">Từ giờ mỗi lần bấm "GG Sheets", dữ liệu sẽ tự đẩy lên sheet "VA".</w:t>
+        <w:t xml:space="preserve">Bấm "Triển khai" → Cấp quyền → Copy URL triển khai</w:t>
+      </w:r>
+    </w:p>
+    <w:p>
+      <w:pPr>
+        <w:spacing w:after="80"/>
+      </w:pPr>
+    </w:p>
+    <w:p>
+      <w:pPr>
+        <w:pStyle w:val="Heading2"/>
+        <w:spacing w:after="100" w:before="200"/>
+      </w:pPr>
+      <w:r>
+        <w:rPr>
+          <w:rFonts w:ascii="Segoe UI" w:cs="Segoe UI" w:eastAsia="Segoe UI" w:hAnsi="Segoe UI"/>
+          <w:b/>
+          <w:bCs/>
+          <w:color w:val="2E86DE"/>
+          <w:sz w:val="24"/>
+          <w:szCs w:val="24"/>
+        </w:rPr>
+        <w:t xml:space="preserve">4.1 Để người khác dùng không cần nhập URL</w:t>
+      </w:r>
+    </w:p>
+    <w:p>
+      <w:pPr>
+        <w:spacing w:after="80"/>
+      </w:pPr>
+      <w:r>
+        <w:rPr>
+          <w:rFonts w:ascii="Segoe UI" w:cs="Segoe UI" w:eastAsia="Segoe UI" w:hAnsi="Segoe UI"/>
+          <w:sz w:val="22"/>
+          <w:szCs w:val="22"/>
+        </w:rPr>
+        <w:t xml:space="preserve">Sau khi có URL Apps Script, mở file </w:t>
+      </w:r>
+      <w:r>
+        <w:rPr>
+          <w:rFonts w:ascii="Consolas" w:cs="Consolas" w:eastAsia="Consolas" w:hAnsi="Consolas"/>
+          <w:color w:val="1E3A5F"/>
+          <w:sz w:val="20"/>
+          <w:szCs w:val="20"/>
+          <w:shd w:fill="F0F4F8" w:color="auto" w:val="clear"/>
+        </w:rPr>
+        <w:t xml:space="preserve">js/google-sheets.js</w:t>
+      </w:r>
+      <w:r>
+        <w:rPr>
+          <w:rFonts w:ascii="Segoe UI" w:cs="Segoe UI" w:eastAsia="Segoe UI" w:hAnsi="Segoe UI"/>
+          <w:sz w:val="22"/>
+          <w:szCs w:val="22"/>
+        </w:rPr>
+        <w:t xml:space="preserve"> và dán URL vào dòng:</w:t>
+      </w:r>
+    </w:p>
+    <w:p>
+      <w:pPr>
+        <w:spacing w:after="30"/>
+        <w:ind w:left="400"/>
+      </w:pPr>
+      <w:r>
+        <w:rPr>
+          <w:rFonts w:ascii="Consolas" w:cs="Consolas" w:eastAsia="Consolas" w:hAnsi="Consolas"/>
+          <w:color w:val="1E3A5F"/>
+          <w:sz w:val="20"/>
+          <w:szCs w:val="20"/>
+          <w:shd w:fill="F0F4F8" w:color="auto" w:val="clear"/>
+        </w:rPr>
+        <w:t xml:space="preserve">const DEFAULT_GS_URL = 'https://script.google.com/macros/s/......./exec';</w:t>
+      </w:r>
+    </w:p>
+    <w:p>
+      <w:pPr>
+        <w:spacing w:after="200"/>
+      </w:pPr>
+      <w:r>
+        <w:rPr>
+          <w:rFonts w:ascii="Segoe UI" w:cs="Segoe UI" w:eastAsia="Segoe UI" w:hAnsi="Segoe UI"/>
+          <w:sz w:val="22"/>
+          <w:szCs w:val="22"/>
+        </w:rPr>
+        <w:t xml:space="preserve">Upload lại lên GitHub → tất cả người dùng bấm "GG Sheets" sẽ tự động push data mà không cần nhập URL.</w:t>
       </w:r>
     </w:p>
     <w:p>
@@ -2694,7 +2189,38 @@
           <w:sz w:val="28"/>
           <w:szCs w:val="28"/>
         </w:rPr>
-        <w:t xml:space="preserve">5. Mẹo sử dụng</w:t>
+        <w:t xml:space="preserve">5. Cài đặt Apps Script — Đúng hay Sai?</w:t>
+      </w:r>
+    </w:p>
+    <w:p>
+      <w:pPr>
+        <w:spacing w:after="100"/>
+      </w:pPr>
+      <w:r>
+        <w:rPr>
+          <w:rFonts w:ascii="Segoe UI" w:cs="Segoe UI" w:eastAsia="Segoe UI" w:hAnsi="Segoe UI"/>
+          <w:sz w:val="22"/>
+          <w:szCs w:val="22"/>
+        </w:rPr>
+        <w:t xml:space="preserve">Để </w:t>
+      </w:r>
+      <w:r>
+        <w:rPr>
+          <w:rFonts w:ascii="Segoe UI" w:cs="Segoe UI" w:eastAsia="Segoe UI" w:hAnsi="Segoe UI"/>
+          <w:b/>
+          <w:bCs/>
+          <w:sz w:val="22"/>
+          <w:szCs w:val="22"/>
+        </w:rPr>
+        <w:t xml:space="preserve">người lạ</w:t>
+      </w:r>
+      <w:r>
+        <w:rPr>
+          <w:rFonts w:ascii="Segoe UI" w:cs="Segoe UI" w:eastAsia="Segoe UI" w:hAnsi="Segoe UI"/>
+          <w:sz w:val="22"/>
+          <w:szCs w:val="22"/>
+        </w:rPr>
+        <w:t xml:space="preserve"> (người bạn chia sẻ link app) có thể push data lên Google Sheets, cài đặt phải đúng như sau:</w:t>
       </w:r>
     </w:p>
     <w:p>
@@ -2708,7 +2234,7 @@
           <w:sz w:val="22"/>
           <w:szCs w:val="22"/>
         </w:rPr>
-        <w:t xml:space="preserve">• Quét liên tục: sau khi Lưu, camera tự resume — đưa CCCD tiếp theo vào luôn</w:t>
+        <w:t xml:space="preserve">✅ Thực thi với tư cách (Execute as): "Tôi" (Me) — script dùng quyền Google của BẠN để ghi vào sheet</w:t>
       </w:r>
     </w:p>
     <w:p>
@@ -2722,83 +2248,67 @@
           <w:sz w:val="22"/>
           <w:szCs w:val="22"/>
         </w:rPr>
-        <w:t xml:space="preserve">• CCCD trùng: app cảnh báo nếu quét lại số CCCD đã có, cho phép ghi đè</w:t>
-      </w:r>
-    </w:p>
-    <w:p>
-      <w:pPr>
-        <w:spacing w:after="60"/>
-        <w:ind w:left="400"/>
-      </w:pPr>
-      <w:r>
-        <w:rPr>
-          <w:rFonts w:ascii="Segoe UI" w:cs="Segoe UI" w:eastAsia="Segoe UI" w:hAnsi="Segoe UI"/>
-          <w:sz w:val="22"/>
-          <w:szCs w:val="22"/>
-        </w:rPr>
-        <w:t xml:space="preserve">• Xóa từng dòng: bấm nút ✕ ở cuối mỗi dòng trong bảng</w:t>
-      </w:r>
-    </w:p>
-    <w:p>
-      <w:pPr>
-        <w:spacing w:after="60"/>
-        <w:ind w:left="400"/>
-      </w:pPr>
-      <w:r>
-        <w:rPr>
-          <w:rFonts w:ascii="Segoe UI" w:cs="Segoe UI" w:eastAsia="Segoe UI" w:hAnsi="Segoe UI"/>
-          <w:sz w:val="22"/>
-          <w:szCs w:val="22"/>
-        </w:rPr>
-        <w:t xml:space="preserve">• Xóa tất cả: bấm "Xóa" → xác nhận → dữ liệu bị xóa hoàn toàn</w:t>
-      </w:r>
-    </w:p>
-    <w:p>
-      <w:pPr>
-        <w:spacing w:after="60"/>
-        <w:ind w:left="400"/>
-      </w:pPr>
-      <w:r>
-        <w:rPr>
-          <w:rFonts w:ascii="Segoe UI" w:cs="Segoe UI" w:eastAsia="Segoe UI" w:hAnsi="Segoe UI"/>
-          <w:sz w:val="22"/>
-          <w:szCs w:val="22"/>
-        </w:rPr>
-        <w:t xml:space="preserve">• Ánh sáng: đảm bảo QR code được chiếu sáng đều, tránh lóa</w:t>
-      </w:r>
-    </w:p>
-    <w:p>
-      <w:pPr>
-        <w:spacing w:after="60"/>
-        <w:ind w:left="400"/>
-      </w:pPr>
-      <w:r>
-        <w:rPr>
-          <w:rFonts w:ascii="Segoe UI" w:cs="Segoe UI" w:eastAsia="Segoe UI" w:hAnsi="Segoe UI"/>
-          <w:sz w:val="22"/>
-          <w:szCs w:val="22"/>
-        </w:rPr>
-        <w:t xml:space="preserve">• Khoảng cách: giữ CCCD cách camera khoảng 10-15cm, QR nằm gọn trong khung</w:t>
-      </w:r>
-    </w:p>
-    <w:p>
-      <w:pPr>
-        <w:spacing w:after="60"/>
-        <w:ind w:left="400"/>
-      </w:pPr>
-      <w:r>
-        <w:rPr>
-          <w:rFonts w:ascii="Segoe UI" w:cs="Segoe UI" w:eastAsia="Segoe UI" w:hAnsi="Segoe UI"/>
-          <w:sz w:val="22"/>
-          <w:szCs w:val="22"/>
-        </w:rPr>
-        <w:t xml:space="preserve">• Nếu camera không quét được: dùng nút 📷 upload ảnh chụp CCCD</w:t>
-      </w:r>
+        <w:t xml:space="preserve">✅ Ai có quyền truy cập (Who has access): "Bất kỳ ai" (Anyone) — ai cũng gọi được API</w:t>
+      </w:r>
+    </w:p>
+    <w:p>
+      <w:pPr>
+        <w:spacing w:after="80"/>
+      </w:pPr>
     </w:p>
     <w:p>
       <w:pPr>
         <w:spacing w:after="100"/>
       </w:pPr>
+      <w:r>
+        <w:rPr>
+          <w:rFonts w:ascii="Segoe UI" w:cs="Segoe UI" w:eastAsia="Segoe UI" w:hAnsi="Segoe UI"/>
+          <w:b/>
+          <w:bCs/>
+          <w:sz w:val="22"/>
+          <w:szCs w:val="22"/>
+        </w:rPr>
+        <w:t xml:space="preserve">⚠️ KHÔNG chọn </w:t>
+      </w:r>
+      <w:r>
+        <w:rPr>
+          <w:rFonts w:ascii="Segoe UI" w:cs="Segoe UI" w:eastAsia="Segoe UI" w:hAnsi="Segoe UI"/>
+          <w:sz w:val="22"/>
+          <w:szCs w:val="22"/>
+        </w:rPr>
+        <w:t xml:space="preserve">"Bất kỳ ai có tài khoản Google" (Anyone with Google account) — vì trên Safari iOS, </w:t>
+      </w:r>
+      <w:r>
+        <w:rPr>
+          <w:rFonts w:ascii="Segoe UI" w:cs="Segoe UI" w:eastAsia="Segoe UI" w:hAnsi="Segoe UI"/>
+          <w:sz w:val="22"/>
+          <w:szCs w:val="22"/>
+        </w:rPr>
+        <w:t xml:space="preserve">người dùng sẽ bị redirect đăng nhập Google và fetch no-cors sẽ fail.</w:t>
+      </w:r>
+    </w:p>
+    <w:p>
+      <w:pPr>
+        <w:spacing w:after="200"/>
+      </w:pPr>
+      <w:r>
+        <w:rPr>
+          <w:rFonts w:ascii="Segoe UI" w:cs="Segoe UI" w:eastAsia="Segoe UI" w:hAnsi="Segoe UI"/>
+          <w:b/>
+          <w:bCs/>
+          <w:sz w:val="22"/>
+          <w:szCs w:val="22"/>
+        </w:rPr>
+        <w:t xml:space="preserve">⚠️ KHÔNG chọn </w:t>
+      </w:r>
+      <w:r>
+        <w:rPr>
+          <w:rFonts w:ascii="Segoe UI" w:cs="Segoe UI" w:eastAsia="Segoe UI" w:hAnsi="Segoe UI"/>
+          <w:sz w:val="22"/>
+          <w:szCs w:val="22"/>
+        </w:rPr>
+        <w:t xml:space="preserve">"Chỉ bản thân tôi" (Only myself) — người khác sẽ không push data được.</w:t>
+      </w:r>
     </w:p>
     <w:p>
       <w:pPr>
@@ -2817,99 +2327,91 @@
           <w:sz w:val="28"/>
           <w:szCs w:val="28"/>
         </w:rPr>
-        <w:t xml:space="preserve">6. Xử lý lỗi thường gặp</w:t>
-      </w:r>
-    </w:p>
-    <w:p>
-      <w:pPr>
-        <w:spacing w:after="100"/>
-      </w:pPr>
-      <w:r>
-        <w:rPr>
-          <w:rFonts w:ascii="Segoe UI" w:cs="Segoe UI" w:eastAsia="Segoe UI" w:hAnsi="Segoe UI"/>
-          <w:b/>
-          <w:bCs/>
-          <w:sz w:val="22"/>
-          <w:szCs w:val="22"/>
-        </w:rPr>
-        <w:t xml:space="preserve">Camera không bật: </w:t>
-      </w:r>
-      <w:r>
-        <w:rPr>
-          <w:rFonts w:ascii="Segoe UI" w:cs="Segoe UI" w:eastAsia="Segoe UI" w:hAnsi="Segoe UI"/>
-          <w:sz w:val="22"/>
-          <w:szCs w:val="22"/>
-        </w:rPr>
-        <w:t xml:space="preserve">Kiểm tra quyền camera trong Cài đặt trình duyệt. Trên iPhone: Cài đặt → Safari → Camera → Cho phép.</w:t>
-      </w:r>
-    </w:p>
-    <w:p>
-      <w:pPr>
-        <w:spacing w:after="100"/>
-      </w:pPr>
-      <w:r>
-        <w:rPr>
-          <w:rFonts w:ascii="Segoe UI" w:cs="Segoe UI" w:eastAsia="Segoe UI" w:hAnsi="Segoe UI"/>
-          <w:b/>
-          <w:bCs/>
-          <w:sz w:val="22"/>
-          <w:szCs w:val="22"/>
-        </w:rPr>
-        <w:t xml:space="preserve">QR không nhận diện: </w:t>
-      </w:r>
-      <w:r>
-        <w:rPr>
-          <w:rFonts w:ascii="Segoe UI" w:cs="Segoe UI" w:eastAsia="Segoe UI" w:hAnsi="Segoe UI"/>
-          <w:sz w:val="22"/>
-          <w:szCs w:val="22"/>
-        </w:rPr>
-        <w:t xml:space="preserve">Đảm bảo QR không bị mờ, che khuất. Thử upload ảnh chụp rõ nét thay vì quét camera trực tiếp.</w:t>
-      </w:r>
-    </w:p>
-    <w:p>
-      <w:pPr>
-        <w:spacing w:after="100"/>
-      </w:pPr>
-      <w:r>
-        <w:rPr>
-          <w:rFonts w:ascii="Segoe UI" w:cs="Segoe UI" w:eastAsia="Segoe UI" w:hAnsi="Segoe UI"/>
-          <w:b/>
-          <w:bCs/>
-          <w:sz w:val="22"/>
-          <w:szCs w:val="22"/>
-        </w:rPr>
-        <w:t xml:space="preserve">Google Sheets không nhận dữ liệu: </w:t>
-      </w:r>
-      <w:r>
-        <w:rPr>
-          <w:rFonts w:ascii="Segoe UI" w:cs="Segoe UI" w:eastAsia="Segoe UI" w:hAnsi="Segoe UI"/>
-          <w:sz w:val="22"/>
-          <w:szCs w:val="22"/>
-        </w:rPr>
-        <w:t xml:space="preserve">Kiểm tra URL Apps Script đã paste đúng chưa. Mở Google Sheets kiểm tra sheet tên "VA" có tồn tại không.</w:t>
-      </w:r>
-    </w:p>
-    <w:p>
-      <w:pPr>
-        <w:spacing w:after="200"/>
-      </w:pPr>
-      <w:r>
-        <w:rPr>
-          <w:rFonts w:ascii="Segoe UI" w:cs="Segoe UI" w:eastAsia="Segoe UI" w:hAnsi="Segoe UI"/>
-          <w:b/>
-          <w:bCs/>
-          <w:sz w:val="22"/>
-          <w:szCs w:val="22"/>
-        </w:rPr>
-        <w:t xml:space="preserve">File Excel bị lỗi số CCCD: </w:t>
-      </w:r>
-      <w:r>
-        <w:rPr>
-          <w:rFonts w:ascii="Segoe UI" w:cs="Segoe UI" w:eastAsia="Segoe UI" w:hAnsi="Segoe UI"/>
-          <w:sz w:val="22"/>
-          <w:szCs w:val="22"/>
-        </w:rPr>
-        <w:t xml:space="preserve">App đã format cột CCCD là text. Nếu vẫn bị, mở Excel → chọn cột → Format Cells → Text.</w:t>
+        <w:t xml:space="preserve">6. Mẹo &amp; xử lý lỗi</w:t>
+      </w:r>
+    </w:p>
+    <w:p>
+      <w:pPr>
+        <w:spacing w:after="60"/>
+        <w:ind w:left="400"/>
+      </w:pPr>
+      <w:r>
+        <w:rPr>
+          <w:rFonts w:ascii="Segoe UI" w:cs="Segoe UI" w:eastAsia="Segoe UI" w:hAnsi="Segoe UI"/>
+          <w:sz w:val="22"/>
+          <w:szCs w:val="22"/>
+        </w:rPr>
+        <w:t xml:space="preserve">• Quét liên tục: sau khi Lưu, camera tự resume — đưa CCCD tiếp theo vào luôn</w:t>
+      </w:r>
+    </w:p>
+    <w:p>
+      <w:pPr>
+        <w:spacing w:after="60"/>
+        <w:ind w:left="400"/>
+      </w:pPr>
+      <w:r>
+        <w:rPr>
+          <w:rFonts w:ascii="Segoe UI" w:cs="Segoe UI" w:eastAsia="Segoe UI" w:hAnsi="Segoe UI"/>
+          <w:sz w:val="22"/>
+          <w:szCs w:val="22"/>
+        </w:rPr>
+        <w:t xml:space="preserve">• CCCD trùng: app cảnh báo, cho phép ghi đè</w:t>
+      </w:r>
+    </w:p>
+    <w:p>
+      <w:pPr>
+        <w:spacing w:after="60"/>
+        <w:ind w:left="400"/>
+      </w:pPr>
+      <w:r>
+        <w:rPr>
+          <w:rFonts w:ascii="Segoe UI" w:cs="Segoe UI" w:eastAsia="Segoe UI" w:hAnsi="Segoe UI"/>
+          <w:sz w:val="22"/>
+          <w:szCs w:val="22"/>
+        </w:rPr>
+        <w:t xml:space="preserve">• Ánh sáng: QR code cần được chiếu sáng đều, tránh lóa</w:t>
+      </w:r>
+    </w:p>
+    <w:p>
+      <w:pPr>
+        <w:spacing w:after="60"/>
+        <w:ind w:left="400"/>
+      </w:pPr>
+      <w:r>
+        <w:rPr>
+          <w:rFonts w:ascii="Segoe UI" w:cs="Segoe UI" w:eastAsia="Segoe UI" w:hAnsi="Segoe UI"/>
+          <w:sz w:val="22"/>
+          <w:szCs w:val="22"/>
+        </w:rPr>
+        <w:t xml:space="preserve">• Camera không bật: kiểm tra quyền camera trong Cài đặt trình duyệt</w:t>
+      </w:r>
+    </w:p>
+    <w:p>
+      <w:pPr>
+        <w:spacing w:after="60"/>
+        <w:ind w:left="400"/>
+      </w:pPr>
+      <w:r>
+        <w:rPr>
+          <w:rFonts w:ascii="Segoe UI" w:cs="Segoe UI" w:eastAsia="Segoe UI" w:hAnsi="Segoe UI"/>
+          <w:sz w:val="22"/>
+          <w:szCs w:val="22"/>
+        </w:rPr>
+        <w:t xml:space="preserve">• QR không nhận: thử upload ảnh chụp rõ nét thay vì quét camera</w:t>
+      </w:r>
+    </w:p>
+    <w:p>
+      <w:pPr>
+        <w:spacing w:after="60"/>
+        <w:ind w:left="400"/>
+      </w:pPr>
+      <w:r>
+        <w:rPr>
+          <w:rFonts w:ascii="Segoe UI" w:cs="Segoe UI" w:eastAsia="Segoe UI" w:hAnsi="Segoe UI"/>
+          <w:sz w:val="22"/>
+          <w:szCs w:val="22"/>
+        </w:rPr>
+        <w:t xml:space="preserve">• GG Sheets không nhận data: kiểm tra URL Apps Script và sheet "VA" có tồn tại</w:t>
       </w:r>
     </w:p>
     <w:sectPr>
@@ -3272,13 +2774,5 @@
       <w:szCs w:val="20"/>
     </w:rPr>
   </w:style>
-  <w:style w:type="paragraph" w:styleId="Normal">
-    <w:name w:val="Normal"/>
-    <w:rPr>
-      <w:rFonts w:ascii="Segoe UI" w:cs="Segoe UI" w:eastAsia="Segoe UI" w:hAnsi="Segoe UI"/>
-      <w:sz w:val="22"/>
-      <w:szCs w:val="22"/>
-    </w:rPr>
-  </w:style>
 </w:styles>
 </file>
</xml_diff>